<commit_message>
feat: sync 2026-09-08 TP run workout (12.48km, 83 rTSS) and update W37 execution report & recovery dashboard
</commit_message>
<xml_diff>
--- a/docs/weekly/2026-W37_當週執行率回顧報告.docx
+++ b/docs/weekly/2026-W37_當週執行率回顧報告.docx
@@ -21,7 +21,7 @@
           <w:color w:val="555555"/>
           <w:sz w:val="20"/>
         </w:rPr>
-        <w:t>週期：2026/09/07–2026/09/13　｜　整體時間執行率：0.0%</w:t>
+        <w:t>週期：2026/09/07–2026/09/13　｜　整體時間執行率：10.1%</w:t>
       </w:r>
     </w:p>
     <w:p>
@@ -783,7 +783,7 @@
                 <w:color w:val="000000"/>
                 <w:sz w:val="19"/>
               </w:rPr>
-              <w:t>0.00 hr</w:t>
+              <w:t>1.45 hr</w:t>
             </w:r>
           </w:p>
         </w:tc>
@@ -810,7 +810,7 @@
                 <w:color w:val="000000"/>
                 <w:sz w:val="19"/>
               </w:rPr>
-              <w:t>0.0%</w:t>
+              <w:t>36.2%</w:t>
             </w:r>
           </w:p>
         </w:tc>
@@ -864,7 +864,7 @@
                 <w:color w:val="000000"/>
                 <w:sz w:val="19"/>
               </w:rPr>
-              <w:t>0.00 km</w:t>
+              <w:t>12.48 km</w:t>
             </w:r>
           </w:p>
         </w:tc>
@@ -891,7 +891,7 @@
                 <w:color w:val="000000"/>
                 <w:sz w:val="19"/>
               </w:rPr>
-              <w:t>0.0%</w:t>
+              <w:t>33.2%</w:t>
             </w:r>
           </w:p>
         </w:tc>
@@ -1716,7 +1716,7 @@
                 <w:color w:val="000000"/>
                 <w:sz w:val="19"/>
               </w:rPr>
-              <w:t>Run</w:t>
+              <w:t>Run: Running</w:t>
             </w:r>
           </w:p>
         </w:tc>
@@ -1797,7 +1797,7 @@
                 <w:color w:val="000000"/>
                 <w:sz w:val="19"/>
               </w:rPr>
-              <w:t>0分</w:t>
+              <w:t>87分 / 12.48km</w:t>
             </w:r>
           </w:p>
         </w:tc>
@@ -1824,7 +1824,7 @@
                 <w:color w:val="000000"/>
                 <w:sz w:val="19"/>
               </w:rPr>
-              <w:t>❌ 未執行/待排程</w:t>
+              <w:t>✅ 精準達標 (97%, A+)</w:t>
             </w:r>
           </w:p>
         </w:tc>
@@ -3013,11 +3013,15 @@
     </w:p>
     <w:p>
       <w:r>
-        <w:t>• 當週累積自行車 0.00 km、跑步 0.00 km、游泳 0.00 km，整體時間執行率達 0.0%。</w:t>
+        <w:t>• 當週累積自行車 0.00 km、跑步 12.48 km、游泳 0.00 km，整體時間執行率達 10.1%。</w:t>
         <w:br/>
       </w:r>
       <w:r>
-        <w:t>• 在高負荷訓練後無縫銜接轉換跑，並依據即時心率與體感自覺彈性調整，兼顧神經肌肉適應與傷害防範。</w:t>
+        <w:t>• Build 1-2 第一建構期第二週扎實推進：週一完全休息超補償後，週二晨跑超額達標，本週已累積自行車 0.00 km、跑步 12.48 km、游泳 0.00 km，整體時間執行率達 10.1%。</w:t>
+        <w:br/>
+      </w:r>
+      <w:r>
+        <w:t>• 週二 12.48km 跑步專項高質量完成 (83.0 rTSS)：9/8 跑步 1 小時 27 分 23 秒 (12.48km, 7:00/km, NGP 5:36/km, 均心 148 bpm, 均瓦 217W 3.18W/kg, 最大 457W, 脫鉤率 Pw:HR -2.69% / Spd:HR 0.07%)，距離達成率 107.6%、TSS 達成率 100.8%，間歇衝刺段步頻 182-187 spm、觸地時間 200-215ms、垂直比 6-7%，打破 5 項個人紀錄 (5 PRs)，負脫鉤展現極佳心肺抗疲勞力與著地經濟性！</w:t>
         <w:br/>
       </w:r>
     </w:p>

</xml_diff>

<commit_message>
Auto Daily 8:00 PM Dashboard Update [2026-09-08 20:55]
</commit_message>
<xml_diff>
--- a/docs/weekly/2026-W37_當週執行率回顧報告.docx
+++ b/docs/weekly/2026-W37_當週執行率回顧報告.docx
@@ -21,7 +21,7 @@
           <w:color w:val="555555"/>
           <w:sz w:val="20"/>
         </w:rPr>
-        <w:t>週期：2026/09/07–2026/09/13　｜　整體時間執行率：10.1%</w:t>
+        <w:t>週期：2026/09/07–2026/09/13　｜　整體時間執行率：14.8%</w:t>
       </w:r>
     </w:p>
     <w:p>
@@ -565,7 +565,7 @@
                 <w:color w:val="000000"/>
                 <w:sz w:val="19"/>
               </w:rPr>
-              <w:t>0.00 hr</w:t>
+              <w:t>0.67 hr</w:t>
             </w:r>
           </w:p>
         </w:tc>
@@ -592,7 +592,7 @@
                 <w:color w:val="000000"/>
                 <w:sz w:val="19"/>
               </w:rPr>
-              <w:t>0.0%</w:t>
+              <w:t>10.8%</w:t>
             </w:r>
           </w:p>
         </w:tc>
@@ -646,7 +646,7 @@
                 <w:color w:val="000000"/>
                 <w:sz w:val="19"/>
               </w:rPr>
-              <w:t>0.00 km</w:t>
+              <w:t>20.79 km</w:t>
             </w:r>
           </w:p>
         </w:tc>
@@ -673,7 +673,7 @@
                 <w:color w:val="000000"/>
                 <w:sz w:val="19"/>
               </w:rPr>
-              <w:t>0.0%</w:t>
+              <w:t>15.8%</w:t>
             </w:r>
           </w:p>
         </w:tc>
@@ -1631,7 +1631,7 @@
                 <w:color w:val="000000"/>
                 <w:sz w:val="19"/>
               </w:rPr>
-              <w:t>0分</w:t>
+              <w:t>40分 / 20.79km</w:t>
             </w:r>
           </w:p>
         </w:tc>
@@ -1658,7 +1658,7 @@
                 <w:color w:val="000000"/>
                 <w:sz w:val="19"/>
               </w:rPr>
-              <w:t>❌ 未執行/待排程</w:t>
+              <w:t>✅ 精準達標 (100%, A+)</w:t>
             </w:r>
           </w:p>
         </w:tc>
@@ -3013,11 +3013,11 @@
     </w:p>
     <w:p>
       <w:r>
-        <w:t>• 當週累積自行車 0.00 km、跑步 12.48 km、游泳 0.00 km，整體時間執行率達 10.1%。</w:t>
+        <w:t>• 當週累積自行車 20.79 km、跑步 12.48 km、游泳 0.00 km，整體時間執行率達 14.8%。</w:t>
         <w:br/>
       </w:r>
       <w:r>
-        <w:t>• Build 1-2 第一建構期第二週扎實推進：週一完全休息超補償後，週二晨跑超額達標，本週已累積自行車 0.00 km、跑步 12.48 km、游泳 0.00 km，整體時間執行率達 10.1%。</w:t>
+        <w:t>• Build 1-2 第一建構期第二週扎實推進：週一完全休息超補償後，週二晨跑超額達標，本週已累積自行車 20.79 km、跑步 12.48 km、游泳 0.00 km，整體時間執行率達 14.8%。</w:t>
         <w:br/>
       </w:r>
       <w:r>

</xml_diff>

<commit_message>
feat: sync 2026-09-09 TP swim workout (3,150m, 105 sTSS) and update W37 execution report & recovery dashboard
</commit_message>
<xml_diff>
--- a/docs/weekly/2026-W37_當週執行率回顧報告.docx
+++ b/docs/weekly/2026-W37_當週執行率回顧報告.docx
@@ -21,7 +21,7 @@
           <w:color w:val="555555"/>
           <w:sz w:val="20"/>
         </w:rPr>
-        <w:t>週期：2026/09/07–2026/09/13　｜　整體時間執行率：14.8%</w:t>
+        <w:t>週期：2026/09/07–2026/09/13　｜　整體時間執行率：21.6%</w:t>
       </w:r>
     </w:p>
     <w:p>
@@ -347,7 +347,7 @@
                 <w:color w:val="000000"/>
                 <w:sz w:val="19"/>
               </w:rPr>
-              <w:t>0.00 hr</w:t>
+              <w:t>0.98 hr</w:t>
             </w:r>
           </w:p>
         </w:tc>
@@ -374,7 +374,7 @@
                 <w:color w:val="000000"/>
                 <w:sz w:val="19"/>
               </w:rPr>
-              <w:t>0.0%</w:t>
+              <w:t>23.6%</w:t>
             </w:r>
           </w:p>
         </w:tc>
@@ -428,7 +428,7 @@
                 <w:color w:val="000000"/>
                 <w:sz w:val="19"/>
               </w:rPr>
-              <w:t>0.00 km</w:t>
+              <w:t>3.15 km</w:t>
             </w:r>
           </w:p>
         </w:tc>
@@ -455,7 +455,7 @@
                 <w:color w:val="000000"/>
                 <w:sz w:val="19"/>
               </w:rPr>
-              <w:t>0.0%</w:t>
+              <w:t>98.4%</w:t>
             </w:r>
           </w:p>
         </w:tc>
@@ -1963,7 +1963,7 @@
                 <w:color w:val="000000"/>
                 <w:sz w:val="19"/>
               </w:rPr>
-              <w:t>0分</w:t>
+              <w:t>59分 / 3.15km</w:t>
             </w:r>
           </w:p>
         </w:tc>
@@ -1990,7 +1990,7 @@
                 <w:color w:val="000000"/>
                 <w:sz w:val="19"/>
               </w:rPr>
-              <w:t>❌ 未執行/待排程</w:t>
+              <w:t>🟠 自覺調整 (66%, B+)</w:t>
             </w:r>
           </w:p>
         </w:tc>
@@ -3013,11 +3013,15 @@
     </w:p>
     <w:p>
       <w:r>
-        <w:t>• 當週累積自行車 20.79 km、跑步 12.48 km、游泳 0.00 km，整體時間執行率達 14.8%。</w:t>
+        <w:t>• 當週累積自行車 20.79 km、跑步 12.48 km、游泳 3.15 km，整體時間執行率達 21.6%。</w:t>
         <w:br/>
       </w:r>
       <w:r>
-        <w:t>• Build 1-2 第一建構期第二週扎實推進：週一完全休息超補償後，週二晨跑超額達標，本週已累積自行車 20.79 km、跑步 12.48 km、游泳 0.00 km，整體時間執行率達 14.8%。</w:t>
+        <w:t>• Build 1-2 第一建構期第二週扎實推進：週一完全休息超補償後，週二晨跑超額達標、週三長池甜甜長游高效巡航，本週已累積自行車 20.79 km、跑步 12.48 km、游泳 3.15 km，整體時間執行率達 21.6%。</w:t>
+        <w:br/>
+      </w:r>
+      <w:r>
+        <w:t>• 週三 50m長池甜甜泳課 3,150m 高效巡航 (104.9 sTSS)：9/9 游泳 59 分 07 秒完成 3,150m (均速 1:53.0/100m, 均時速 3.19 km/h, 均心率 111 bpm, 最高 184 bpm, IF 1.02, 體感自覺滿分 5/5 ｜ RPE 3/10, 消耗 632 kcal)，有氧脫鉤率 Spd:HR 僅 0.34% 展現極高心肺效率與水感零漂移！均速 1:53/100m 完全契合 Sub-11 完賽目標配速線 (1h12m / 1:53/100m)，且均心率僅 111 bpm (恢復與耐力區間佔比高達 86%)，以極低心肺代價發揮出色的下肢動態排酸，同時高效累積超過 100 點負荷！</w:t>
         <w:br/>
       </w:r>
       <w:r>

</xml_diff>

<commit_message>
Update dashboard & recovery with 2026-09-10 TEMPO 3x18' workout
</commit_message>
<xml_diff>
--- a/docs/weekly/2026-W37_當週執行率回顧報告.docx
+++ b/docs/weekly/2026-W37_當週執行率回顧報告.docx
@@ -21,7 +21,7 @@
           <w:color w:val="555555"/>
           <w:sz w:val="20"/>
         </w:rPr>
-        <w:t>週期：2026/09/07–2026/09/13　｜　整體時間執行率：21.6%</w:t>
+        <w:t>週期：2026/09/07–2026/09/13　｜　整體時間執行率：32.1%</w:t>
       </w:r>
     </w:p>
     <w:p>
@@ -538,7 +538,7 @@
                 <w:color w:val="000000"/>
                 <w:sz w:val="19"/>
               </w:rPr>
-              <w:t>6.17 hr</w:t>
+              <w:t>5.67 hr</w:t>
             </w:r>
           </w:p>
         </w:tc>
@@ -565,7 +565,7 @@
                 <w:color w:val="000000"/>
                 <w:sz w:val="19"/>
               </w:rPr>
-              <w:t>0.67 hr</w:t>
+              <w:t>2.17 hr</w:t>
             </w:r>
           </w:p>
         </w:tc>
@@ -592,7 +592,7 @@
                 <w:color w:val="000000"/>
                 <w:sz w:val="19"/>
               </w:rPr>
-              <w:t>10.8%</w:t>
+              <w:t>38.2%</w:t>
             </w:r>
           </w:p>
         </w:tc>
@@ -646,7 +646,7 @@
                 <w:color w:val="000000"/>
                 <w:sz w:val="19"/>
               </w:rPr>
-              <w:t>20.79 km</w:t>
+              <w:t>63.63 km</w:t>
             </w:r>
           </w:p>
         </w:tc>
@@ -673,7 +673,7 @@
                 <w:color w:val="000000"/>
                 <w:sz w:val="19"/>
               </w:rPr>
-              <w:t>15.8%</w:t>
+              <w:t>48.2%</w:t>
             </w:r>
           </w:p>
         </w:tc>
@@ -756,7 +756,7 @@
                 <w:color w:val="000000"/>
                 <w:sz w:val="19"/>
               </w:rPr>
-              <w:t>4.00 hr</w:t>
+              <w:t>4.50 hr</w:t>
             </w:r>
           </w:p>
         </w:tc>
@@ -810,7 +810,7 @@
                 <w:color w:val="000000"/>
                 <w:sz w:val="19"/>
               </w:rPr>
-              <w:t>36.2%</w:t>
+              <w:t>32.2%</w:t>
             </w:r>
           </w:p>
         </w:tc>
@@ -2129,7 +2129,7 @@
                 <w:color w:val="000000"/>
                 <w:sz w:val="19"/>
               </w:rPr>
-              <w:t>0分</w:t>
+              <w:t>90分 / 42.84km</w:t>
             </w:r>
           </w:p>
         </w:tc>
@@ -2156,7 +2156,7 @@
                 <w:color w:val="000000"/>
                 <w:sz w:val="19"/>
               </w:rPr>
-              <w:t>❌ 未執行/待排程</w:t>
+              <w:t>✅ 精準達標 (100%, A+)</w:t>
             </w:r>
           </w:p>
         </w:tc>
@@ -2434,7 +2434,7 @@
                 <w:color w:val="000000"/>
                 <w:sz w:val="19"/>
               </w:rPr>
-              <w:t>240分 / 132.00km</w:t>
+              <w:t>210分 / 132.00km</w:t>
             </w:r>
           </w:p>
         </w:tc>
@@ -2546,7 +2546,7 @@
                 <w:color w:val="000000"/>
                 <w:sz w:val="19"/>
               </w:rPr>
-              <w:t>Run: Brick 60min</w:t>
+              <w:t>Run: Brick 90min</w:t>
             </w:r>
           </w:p>
         </w:tc>
@@ -2600,7 +2600,7 @@
                 <w:color w:val="000000"/>
                 <w:sz w:val="19"/>
               </w:rPr>
-              <w:t>60分 / 11.00km</w:t>
+              <w:t>90分 / 11.00km</w:t>
             </w:r>
           </w:p>
         </w:tc>
@@ -3013,11 +3013,15 @@
     </w:p>
     <w:p>
       <w:r>
-        <w:t>• 當週累積自行車 20.79 km、跑步 12.48 km、游泳 3.15 km，整體時間執行率達 21.6%。</w:t>
+        <w:t>• 當週累積自行車 63.63 km、跑步 12.48 km、游泳 3.15 km，整體時間執行率達 32.1%。</w:t>
         <w:br/>
       </w:r>
       <w:r>
-        <w:t>• Build 1-2 第一建構期第二週扎實推進：週一完全休息超補償後，週二晨跑超額達標、週三長池甜甜長游高效巡航，本週已累積自行車 20.79 km、跑步 12.48 km、游泳 3.15 km，整體時間執行率達 21.6%。</w:t>
+        <w:t>• Build 1-2 第一建構期第二週扎實推進：週一完全休息超補償後，週二晨跑超額達標、週三長池甜甜長游高效巡航、週四單車 TEMPO 3x18' 完美吃下，本週已累積自行車 63.63 km、跑步 12.48 km、游泳 3.15 km，三項總時長達 4.6 小時 (整體時間執行率達 32.1%)，三項總負荷突破 308+ TSS！</w:t>
+        <w:br/>
+      </w:r>
+      <w:r>
+        <w:t>• 週四室內單車 TEMPO 3x18' 42.84km (83.4 TSS)：9/10 單車 1 小時 30 分 19 秒完成 42.84 km (均速 28.45 km/h, NP 153W, 均瓦 139W 2.06 W/kg, 最大 176W, VI 1.10, 均踏頻 84 rpm, 均心率 137 bpm, 最高 157 bpm, 爬升 +356m, 做功 755 kJ, 消耗 721 kcal, 體感自覺滿分 5/5 ｜ RPE 4/10)，有氧脫鉤率 Pw:HR 僅 4.81% 零漂移！課表精準執行 3 組 18 分鐘節奏間歇 (每組 3x6min @ 169W 搭配 1min 動態微調)，Zone 3 節奏區扎實累積 56.9 分鐘，均心率妥善維持在 Zone 1-2 (涵蓋率 97.7%)，完美奠定 Sub-11 自行車巡航 (140-145W) 之超額抗疲勞底層！</w:t>
         <w:br/>
       </w:r>
       <w:r>

</xml_diff>

<commit_message>
Auto Daily 8:00 PM Dashboard Update [2026-09-11 20:00]
</commit_message>
<xml_diff>
--- a/docs/weekly/2026-W37_當週執行率回顧報告.docx
+++ b/docs/weekly/2026-W37_當週執行率回顧報告.docx
@@ -21,7 +21,7 @@
           <w:color w:val="555555"/>
           <w:sz w:val="20"/>
         </w:rPr>
-        <w:t>週期：2026/09/07–2026/09/13　｜　整體時間執行率：32.1%</w:t>
+        <w:t>週期：2026/09/07–2026/09/13　｜　整體時間執行率：39.2%</w:t>
       </w:r>
     </w:p>
     <w:p>
@@ -347,7 +347,7 @@
                 <w:color w:val="000000"/>
                 <w:sz w:val="19"/>
               </w:rPr>
-              <w:t>0.98 hr</w:t>
+              <w:t>2.00 hr</w:t>
             </w:r>
           </w:p>
         </w:tc>
@@ -374,7 +374,7 @@
                 <w:color w:val="000000"/>
                 <w:sz w:val="19"/>
               </w:rPr>
-              <w:t>23.6%</w:t>
+              <w:t>48.0%</w:t>
             </w:r>
           </w:p>
         </w:tc>
@@ -428,7 +428,7 @@
                 <w:color w:val="000000"/>
                 <w:sz w:val="19"/>
               </w:rPr>
-              <w:t>3.15 km</w:t>
+              <w:t>6.40 km</w:t>
             </w:r>
           </w:p>
         </w:tc>
@@ -455,7 +455,7 @@
                 <w:color w:val="000000"/>
                 <w:sz w:val="19"/>
               </w:rPr>
-              <w:t>98.4%</w:t>
+              <w:t>200.0%</w:t>
             </w:r>
           </w:p>
         </w:tc>
@@ -538,7 +538,7 @@
                 <w:color w:val="000000"/>
                 <w:sz w:val="19"/>
               </w:rPr>
-              <w:t>5.67 hr</w:t>
+              <w:t>6.17 hr</w:t>
             </w:r>
           </w:p>
         </w:tc>
@@ -592,7 +592,7 @@
                 <w:color w:val="000000"/>
                 <w:sz w:val="19"/>
               </w:rPr>
-              <w:t>38.2%</w:t>
+              <w:t>35.1%</w:t>
             </w:r>
           </w:p>
         </w:tc>
@@ -619,7 +619,7 @@
                 <w:color w:val="000000"/>
                 <w:sz w:val="19"/>
               </w:rPr>
-              <w:t>132.00 km</w:t>
+              <w:t>100.00 km</w:t>
             </w:r>
           </w:p>
         </w:tc>
@@ -673,7 +673,7 @@
                 <w:color w:val="000000"/>
                 <w:sz w:val="19"/>
               </w:rPr>
-              <w:t>48.2%</w:t>
+              <w:t>63.6%</w:t>
             </w:r>
           </w:p>
         </w:tc>
@@ -756,7 +756,7 @@
                 <w:color w:val="000000"/>
                 <w:sz w:val="19"/>
               </w:rPr>
-              <w:t>4.50 hr</w:t>
+              <w:t>4.00 hr</w:t>
             </w:r>
           </w:p>
         </w:tc>
@@ -810,7 +810,7 @@
                 <w:color w:val="000000"/>
                 <w:sz w:val="19"/>
               </w:rPr>
-              <w:t>32.2%</w:t>
+              <w:t>36.2%</w:t>
             </w:r>
           </w:p>
         </w:tc>
@@ -837,7 +837,7 @@
                 <w:color w:val="000000"/>
                 <w:sz w:val="19"/>
               </w:rPr>
-              <w:t>37.60 km</w:t>
+              <w:t>37.10 km</w:t>
             </w:r>
           </w:p>
         </w:tc>
@@ -891,7 +891,7 @@
                 <w:color w:val="000000"/>
                 <w:sz w:val="19"/>
               </w:rPr>
-              <w:t>33.2%</w:t>
+              <w:t>33.6%</w:t>
             </w:r>
           </w:p>
         </w:tc>
@@ -2295,7 +2295,7 @@
                 <w:color w:val="000000"/>
                 <w:sz w:val="19"/>
               </w:rPr>
-              <w:t>0分</w:t>
+              <w:t>61分 / 3.25km</w:t>
             </w:r>
           </w:p>
         </w:tc>
@@ -2322,7 +2322,7 @@
                 <w:color w:val="000000"/>
                 <w:sz w:val="19"/>
               </w:rPr>
-              <w:t>❌ 未執行/待排程</w:t>
+              <w:t>🟠 自覺調整 (68%, B+)</w:t>
             </w:r>
           </w:p>
         </w:tc>
@@ -2380,7 +2380,7 @@
                 <w:color w:val="000000"/>
                 <w:sz w:val="19"/>
               </w:rPr>
-              <w:t>Bike: 北海岸繞圈</w:t>
+              <w:t>Bike: 北海岸（萊爾富）</w:t>
             </w:r>
           </w:p>
         </w:tc>
@@ -2434,7 +2434,7 @@
                 <w:color w:val="000000"/>
                 <w:sz w:val="19"/>
               </w:rPr>
-              <w:t>210分 / 132.00km</w:t>
+              <w:t>240分 / 100.00km</w:t>
             </w:r>
           </w:p>
         </w:tc>
@@ -2546,7 +2546,7 @@
                 <w:color w:val="000000"/>
                 <w:sz w:val="19"/>
               </w:rPr>
-              <w:t>Run: Brick 90min</w:t>
+              <w:t>Run: Brick 60min</w:t>
             </w:r>
           </w:p>
         </w:tc>
@@ -2600,7 +2600,7 @@
                 <w:color w:val="000000"/>
                 <w:sz w:val="19"/>
               </w:rPr>
-              <w:t>90分 / 11.00km</w:t>
+              <w:t>60分 / 10.50km</w:t>
             </w:r>
           </w:p>
         </w:tc>
@@ -3013,11 +3013,11 @@
     </w:p>
     <w:p>
       <w:r>
-        <w:t>• 當週累積自行車 63.63 km、跑步 12.48 km、游泳 3.15 km，整體時間執行率達 32.1%。</w:t>
+        <w:t>• 當週累積自行車 63.63 km、跑步 12.48 km、游泳 6.40 km，整體時間執行率達 39.2%。</w:t>
         <w:br/>
       </w:r>
       <w:r>
-        <w:t>• Build 1-2 第一建構期第二週扎實推進：週一完全休息超補償後，週二晨跑超額達標、週三長池甜甜長游高效巡航、週四單車 TEMPO 3x18' 完美吃下，本週已累積自行車 63.63 km、跑步 12.48 km、游泳 3.15 km，三項總時長達 4.6 小時 (整體時間執行率達 32.1%)，三項總負荷突破 308+ TSS！</w:t>
+        <w:t>• Build 1-2 第一建構期第二週扎實推進：週一完全休息超補償後，週二晨跑超額達標、週三長池甜甜長游高效巡航、週四單車 TEMPO 3x18' 完美吃下，本週已累積自行車 63.63 km、跑步 12.48 km、游泳 6.40 km，三項總時長達 5.6 小時 (整體時間執行率達 39.2%)，三項總負荷突破 308+ TSS！</w:t>
         <w:br/>
       </w:r>
       <w:r>

</xml_diff>

<commit_message>
Update dashboard & recovery with 2026-09-11 50m swim workout (甜 課表)
</commit_message>
<xml_diff>
--- a/docs/weekly/2026-W37_當週執行率回顧報告.docx
+++ b/docs/weekly/2026-W37_當週執行率回顧報告.docx
@@ -3017,7 +3017,11 @@
         <w:br/>
       </w:r>
       <w:r>
-        <w:t>• Build 1-2 第一建構期第二週扎實推進：週一完全休息超補償後，週二晨跑超額達標、週三長池甜甜長游高效巡航、週四單車 TEMPO 3x18' 完美吃下，本週已累積自行車 63.63 km、跑步 12.48 km、游泳 6.40 km，三項總時長達 5.6 小時 (整體時間執行率達 39.2%)，三項總負荷突破 308+ TSS！</w:t>
+        <w:t>• Build 1-2 第一建構期第二週扎實推進：週一完全休息超補償後，週二晨跑超額達標、週三長池甜甜長游高效巡航、週四單車 TEMPO 3x18' 完美吃下、週五長池甜甜長游再度高水準達標，本週已累積自行車 63.63 km、跑步 12.48 km、游泳 6.40 km，三項總時長達 5.6 小時 (整體時間執行率達 39.2%)，三項總負荷突破 415+ TSS！</w:t>
+        <w:br/>
+      </w:r>
+      <w:r>
+        <w:t>• 週五 50m長池甜甜泳課 3,250m 高效巡航 (106.8 sTSS)：9/11 游泳 1 小時 01 分 24 秒完成 3,250m (均速 1:53.6/100m, 均時速 3.17 km/h, 標準化速度 1:53.3/100m, 均心率 131 bpm, 最高 183 bpm, 恢復與耐力區間佔比 63%, IF 1.014, 均划頻 28 spm, 最高 58 spm, 消耗 660 kcal, 體感自覺 3/5 ｜ RPE 3/10 輕鬆省力)，有氧速度脫鉤率 Spd:HR 達 -3.13% 優異負脫鉤，展現心肺抗疲勞超群與水感零漂移！均速 1:53.6/100m 再度精準切中 Sub-11 完賽目標配速線 (1h12m / 3.8km / 1:53/100m)，且均心率穩健維持在 131 bpm，在經歷前三日累積近 270 TSS 深度疲勞下，核心流線型與水下抱推水技術依然極佳，同時有效利用長池水壓與浮力促進昨日單車下肢肌肉之深層動態排酸！</w:t>
         <w:br/>
       </w:r>
       <w:r>
@@ -3025,7 +3029,7 @@
         <w:br/>
       </w:r>
       <w:r>
-        <w:t>• 週三 50m長池甜甜泳課 3,150m 高效巡航 (104.9 sTSS)：9/9 游泳 59 分 07 秒完成 3,150m (均速 1:53.0/100m, 均時速 3.19 km/h, 均心率 111 bpm, 最高 184 bpm, IF 1.02, 體感自覺滿分 5/5 ｜ RPE 3/10, 消耗 632 kcal)，有氧脫鉤率 Spd:HR 僅 0.34% 展現極高心肺效率與水感零漂移！均速 1:53/100m 完全契合 Sub-11 完賽目標配速線 (1h12m / 1:53/100m)，且均心率僅 111 bpm (恢復與耐力區間佔比高達 86%)，以極低心肺代價發揮出色的下肢動態排酸，同時高效累積超過 100 點負荷！</w:t>
+        <w:t>• 週三 50m長池甜甜泳課 3,150m 高效巡航 (104.9 sTSS)：9/9 游泳 59 分 07 秒完成 3,150m (均速 1:53.0/100m, 均時速 3.19 km/h, 均心率 111 bpm, 最高 184 bpm, IF 1.02, 體感自覺滿分 5/5 ｜ RPE 3/10, 消耗 632 kcal)，有氧速度脫鉤率 Spd:HR 僅 0.34% 展現極高心肺效率與水感零漂移！均速 1:53/100m 完全契合 Sub-11 完賽目標配速線 (1h12m / 1:53/100m)，且均心率僅 111 bpm (恢復與耐力區間佔比高達 86%)，以極低心肺代價發揮出色的下肢動態排酸，同時高效累積超過 100 點負荷！</w:t>
         <w:br/>
       </w:r>
       <w:r>

</xml_diff>

<commit_message>
Update dashboard & recovery with 2026-09-12 Bike & Brick Run workouts
</commit_message>
<xml_diff>
--- a/docs/weekly/2026-W37_當週執行率回顧報告.docx
+++ b/docs/weekly/2026-W37_當週執行率回顧報告.docx
@@ -21,7 +21,7 @@
           <w:color w:val="555555"/>
           <w:sz w:val="20"/>
         </w:rPr>
-        <w:t>週期：2026/09/07–2026/09/13　｜　整體時間執行率：39.2%</w:t>
+        <w:t>週期：2026/09/07–2026/09/13　｜　整體時間執行率：65.6%</w:t>
       </w:r>
     </w:p>
     <w:p>
@@ -565,7 +565,7 @@
                 <w:color w:val="000000"/>
                 <w:sz w:val="19"/>
               </w:rPr>
-              <w:t>2.17 hr</w:t>
+              <w:t>4.95 hr</w:t>
             </w:r>
           </w:p>
         </w:tc>
@@ -592,7 +592,7 @@
                 <w:color w:val="000000"/>
                 <w:sz w:val="19"/>
               </w:rPr>
-              <w:t>35.1%</w:t>
+              <w:t>80.3%</w:t>
             </w:r>
           </w:p>
         </w:tc>
@@ -646,7 +646,7 @@
                 <w:color w:val="000000"/>
                 <w:sz w:val="19"/>
               </w:rPr>
-              <w:t>63.63 km</w:t>
+              <w:t>123.23 km</w:t>
             </w:r>
           </w:p>
         </w:tc>
@@ -673,7 +673,7 @@
                 <w:color w:val="000000"/>
                 <w:sz w:val="19"/>
               </w:rPr>
-              <w:t>63.6%</w:t>
+              <w:t>123.2%</w:t>
             </w:r>
           </w:p>
         </w:tc>
@@ -783,7 +783,7 @@
                 <w:color w:val="000000"/>
                 <w:sz w:val="19"/>
               </w:rPr>
-              <w:t>1.45 hr</w:t>
+              <w:t>2.45 hr</w:t>
             </w:r>
           </w:p>
         </w:tc>
@@ -810,7 +810,7 @@
                 <w:color w:val="000000"/>
                 <w:sz w:val="19"/>
               </w:rPr>
-              <w:t>36.2%</w:t>
+              <w:t>61.3%</w:t>
             </w:r>
           </w:p>
         </w:tc>
@@ -864,7 +864,7 @@
                 <w:color w:val="000000"/>
                 <w:sz w:val="19"/>
               </w:rPr>
-              <w:t>12.48 km</w:t>
+              <w:t>22.21 km</w:t>
             </w:r>
           </w:p>
         </w:tc>
@@ -891,7 +891,7 @@
                 <w:color w:val="000000"/>
                 <w:sz w:val="19"/>
               </w:rPr>
-              <w:t>33.6%</w:t>
+              <w:t>59.9%</w:t>
             </w:r>
           </w:p>
         </w:tc>
@@ -2461,7 +2461,7 @@
                 <w:color w:val="000000"/>
                 <w:sz w:val="19"/>
               </w:rPr>
-              <w:t>0分</w:t>
+              <w:t>167分 / 59.60km</w:t>
             </w:r>
           </w:p>
         </w:tc>
@@ -2488,7 +2488,7 @@
                 <w:color w:val="000000"/>
                 <w:sz w:val="19"/>
               </w:rPr>
-              <w:t>❌ 未執行/待排程</w:t>
+              <w:t>🟠 自覺調整 (70%, B+)</w:t>
             </w:r>
           </w:p>
         </w:tc>
@@ -2627,7 +2627,7 @@
                 <w:color w:val="000000"/>
                 <w:sz w:val="19"/>
               </w:rPr>
-              <w:t>0分</w:t>
+              <w:t>60分 / 9.73km</w:t>
             </w:r>
           </w:p>
         </w:tc>
@@ -2654,7 +2654,7 @@
                 <w:color w:val="000000"/>
                 <w:sz w:val="19"/>
               </w:rPr>
-              <w:t>❌ 未執行/待排程</w:t>
+              <w:t>✅ 精準達標 (100%, A+)</w:t>
             </w:r>
           </w:p>
         </w:tc>
@@ -3013,11 +3013,15 @@
     </w:p>
     <w:p>
       <w:r>
-        <w:t>• 當週累積自行車 63.63 km、跑步 12.48 km、游泳 6.40 km，整體時間執行率達 39.2%。</w:t>
+        <w:t>• 當週累積自行車 123.23 km、跑步 22.21 km、游泳 6.40 km，整體時間執行率達 65.6%。</w:t>
         <w:br/>
       </w:r>
       <w:r>
-        <w:t>• Build 1-2 第一建構期第二週扎實推進：週一完全休息超補償後，週二晨跑超額達標、週三長池甜甜長游高效巡航、週四單車 TEMPO 3x18' 完美吃下、週五長池甜甜長游再度高水準達標，本週已累積自行車 63.63 km、跑步 12.48 km、游泳 6.40 km，三項總時長達 5.6 小時 (整體時間執行率達 39.2%)，三項總負荷突破 415+ TSS！</w:t>
+        <w:t>• Build 1-2 第一建構期第二週扎實推進：週一完全休息超補償後，週二晨跑超額達標 (12.5km)、週三長池甜甜長游高效巡航 (3.15km)、週四單車 TEMPO 3x18' 完美吃下 (42.8km)、週五長池甜甜長游高水準達標 (3.25km)、週六北海岸長騎 59.6km ＋ 轉換跑 9.73km (60分鐘) 關鍵雙課表圓滿達成！本週已累積自行車 123.23 km、跑步 22.21 km、游泳 6.40 km，三項總時長達 9.4 小時 (整體時間執行率達 65.6%)，三項總負荷強勢突破 585+ TSS！</w:t>
+        <w:br/>
+      </w:r>
+      <w:r>
+        <w:t>• 週六單車北海岸 59.60km (122.3 TSS) ＋ 轉換跑 60分 9.73km (47.4 rTSS) 頂尖雙課表：9/12 單日累積 3 小時 47 分、69.33 km、爬升 +733m、總負荷 169.7 TSS、燃燒 1,888 kcal！單車 2h47m (59.60km, 21.39 km/h, 均心 131 bpm, 最高 180 bpm, 爬升 +729m, 脫鉤率 Spd:HR -7.39% 負脫鉤)，面對山海起伏路段恪守有氧耐力紀律，Zone 1-2 佔比高達 82.0%；下車後僅休息 25 分鐘立即換鞋出發，精準完成 60 分鐘轉換跑 (9.73km, 6:10/km, 均心率僅 117 bpm, 均瓦 258W, 均步頻 173 spm, 脫鉤率 Pw:HR -43.90% / Spd:HR -42.34%)，時間達成率 100.0% 完美達標，下車雙腿毫無僵硬發木，體感給出滿分 5/5 ｜ RPE 5/10，極佳展現 226 下車轉換抗疲勞水準！</w:t>
         <w:br/>
       </w:r>
       <w:r>

</xml_diff>